<commit_message>
Added indexed terms for DOCX.
</commit_message>
<xml_diff>
--- a/main.docx
+++ b/main.docx
@@ -40,14 +40,14 @@
         <w:rPr>
           <w:i/>
         </w:rPr>
-        <w:t>Skapad: 2026-06-22 21:25:23</w:t>
+        <w:t>Skapad: 2026-06-23 15:57:43</w:t>
         <w:br/>
       </w:r>
       <w:r>
         <w:rPr>
           <w:i/>
         </w:rPr>
-        <w:t>Ändrad: 2026-06-22 21:13:30</w:t>
+        <w:t>Ändrad: 2026-06-22 22:09:51</w:t>
       </w:r>
     </w:p>
     <w:p>
@@ -79,14 +79,6 @@
       </w:pPr>
       <w:r>
         <w:t>The second chapter.</w:t>
-      </w:r>
-    </w:p>
-    <w:p>
-      <w:pPr>
-        <w:pStyle w:val="BodyText"/>
-      </w:pPr>
-      <w:r>
-        <w:t>Referenser</w:t>
       </w:r>
     </w:p>
     <w:p>
@@ -255,6 +247,18 @@
           <w:t>another</w:t>
         </w:r>
       </w:hyperlink>
+      <w:r>
+        <w:t xml:space="preserve">. Here is an </w:t>
+      </w:r>
+      <w:r>
+        <w:rPr>
+          <w:u w:val="single"/>
+        </w:rPr>
+        <w:t>indexed</w:t>
+      </w:r>
+      <w:r>
+        <w:t xml:space="preserve"> term.</w:t>
+      </w:r>
     </w:p>
     <w:p>
       <w:pPr/>
@@ -353,6 +357,51 @@
         <w:t xml:space="preserve">    for subtext in text.subtexts:</w:t>
         <w:br/>
         <w:t xml:space="preserve">        self.write_text(subtext, level=level + 1)</w:t>
+      </w:r>
+    </w:p>
+    <w:p>
+      <w:r>
+        <w:br w:type="page"/>
+      </w:r>
+    </w:p>
+    <w:p>
+      <w:pPr>
+        <w:pStyle w:val="Title1"/>
+      </w:pPr>
+      <w:r>
+        <w:t>Referenser</w:t>
+      </w:r>
+    </w:p>
+    <w:p>
+      <w:r>
+        <w:br w:type="page"/>
+      </w:r>
+    </w:p>
+    <w:p>
+      <w:pPr>
+        <w:pStyle w:val="Title1"/>
+      </w:pPr>
+      <w:r>
+        <w:t>Register</w:t>
+      </w:r>
+    </w:p>
+    <w:p>
+      <w:pPr>
+        <w:pStyle w:val="BodyText"/>
+        <w:keepNext/>
+      </w:pPr>
+      <w:r>
+        <w:t>indexed</w:t>
+      </w:r>
+    </w:p>
+    <w:p>
+      <w:pPr>
+        <w:pStyle w:val="BodyText"/>
+        <w:spacing w:after="160"/>
+        <w:ind w:left="300"/>
+      </w:pPr>
+      <w:r>
+        <w:t>chapter1</w:t>
       </w:r>
     </w:p>
     <w:sectPr>

</xml_diff>

<commit_message>
Paragraph numbers and command-line arguments. Closes #2. Closes #3.
</commit_message>
<xml_diff>
--- a/main.docx
+++ b/main.docx
@@ -29,25 +29,13 @@
     <w:p>
       <w:pPr/>
       <w:r>
-        <w:t>This is a synopsis, or some such text.</w:t>
-      </w:r>
-    </w:p>
-    <w:p>
-      <w:pPr>
-        <w:spacing w:before="1600"/>
-      </w:pPr>
-      <w:r>
         <w:rPr>
-          <w:i/>
+          <w:rStyle w:val="IntenseQuoteChar"/>
         </w:rPr>
-        <w:t>Skapad: 2026-06-24 15:00:58</w:t>
-        <w:br/>
+        <w:t xml:space="preserve">1. </w:t>
       </w:r>
       <w:r>
-        <w:rPr>
-          <w:i/>
-        </w:rPr>
-        <w:t>Ändrad: 2026-06-24 14:52:23</w:t>
+        <w:t>This is a synopsis, or some such text.</w:t>
       </w:r>
     </w:p>
     <w:p>
@@ -113,6 +101,12 @@
     <w:p>
       <w:pPr/>
       <w:r>
+        <w:rPr>
+          <w:rStyle w:val="IntenseQuoteChar"/>
+        </w:rPr>
+        <w:t xml:space="preserve">2. </w:t>
+      </w:r>
+      <w:r>
         <w:t>This is chapter 1, without explicit title.</w:t>
       </w:r>
     </w:p>
@@ -159,6 +153,12 @@
     <w:p>
       <w:pPr/>
       <w:r>
+        <w:rPr>
+          <w:rStyle w:val="IntenseQuoteChar"/>
+        </w:rPr>
+        <w:t xml:space="preserve">3. </w:t>
+      </w:r>
+      <w:r>
         <w:t>And some ordinary text.</w:t>
       </w:r>
     </w:p>
@@ -166,6 +166,12 @@
       <w:pPr>
         <w:pStyle w:val="ListBullet"/>
       </w:pPr>
+      <w:r>
+        <w:rPr>
+          <w:rStyle w:val="IntenseQuoteChar"/>
+        </w:rPr>
+        <w:t xml:space="preserve">4. </w:t>
+      </w:r>
       <w:r>
         <w:t>List item</w:t>
       </w:r>
@@ -175,6 +181,12 @@
         <w:pStyle w:val="ListBullet"/>
       </w:pPr>
       <w:r>
+        <w:rPr>
+          <w:rStyle w:val="IntenseQuoteChar"/>
+        </w:rPr>
+        <w:t xml:space="preserve">5. </w:t>
+      </w:r>
+      <w:r>
         <w:t>Another list item</w:t>
       </w:r>
     </w:p>
@@ -182,6 +194,12 @@
       <w:pPr>
         <w:pStyle w:val="ListNumber"/>
       </w:pPr>
+      <w:r>
+        <w:rPr>
+          <w:rStyle w:val="IntenseQuoteChar"/>
+        </w:rPr>
+        <w:t xml:space="preserve">6. </w:t>
+      </w:r>
       <w:r>
         <w:t>First list item</w:t>
       </w:r>
@@ -191,6 +209,12 @@
         <w:pStyle w:val="ListNumber"/>
       </w:pPr>
       <w:r>
+        <w:rPr>
+          <w:rStyle w:val="IntenseQuoteChar"/>
+        </w:rPr>
+        <w:t xml:space="preserve">7. </w:t>
+      </w:r>
+      <w:r>
         <w:t>Second list item</w:t>
       </w:r>
     </w:p>
@@ -198,6 +222,12 @@
       <w:pPr>
         <w:pStyle w:val="ListBullet2"/>
       </w:pPr>
+      <w:r>
+        <w:rPr>
+          <w:rStyle w:val="IntenseQuoteChar"/>
+        </w:rPr>
+        <w:t xml:space="preserve">8. </w:t>
+      </w:r>
       <w:r>
         <w:t>Sublist item</w:t>
       </w:r>
@@ -207,11 +237,23 @@
         <w:pStyle w:val="ListBullet2"/>
       </w:pPr>
       <w:r>
+        <w:rPr>
+          <w:rStyle w:val="IntenseQuoteChar"/>
+        </w:rPr>
+        <w:t xml:space="preserve">9. </w:t>
+      </w:r>
+      <w:r>
         <w:t>Another sublist item</w:t>
       </w:r>
     </w:p>
     <w:p>
       <w:pPr/>
+      <w:r>
+        <w:rPr>
+          <w:rStyle w:val="IntenseQuoteChar"/>
+        </w:rPr>
+        <w:t xml:space="preserve">10. </w:t>
+      </w:r>
       <w:r>
         <w:rPr>
           <w:i/>
@@ -235,9 +277,15 @@
     <w:p>
       <w:pPr/>
       <w:r>
+        <w:rPr>
+          <w:rStyle w:val="IntenseQuoteChar"/>
+        </w:rPr>
+        <w:t xml:space="preserve">11. </w:t>
+      </w:r>
+      <w:r>
         <w:t xml:space="preserve">More text in a new paragraph with a </w:t>
       </w:r>
-      <w:hyperlink r:id="rId10">
+      <w:hyperlink r:id="rId11">
         <w:r>
           <w:rPr>
             <w:color w:val="2222FF"/>
@@ -254,7 +302,7 @@
       <w:r>
         <w:t xml:space="preserve">and </w:t>
       </w:r>
-      <w:hyperlink r:id="rId11">
+      <w:hyperlink r:id="rId12">
         <w:r>
           <w:rPr>
             <w:color w:val="2222FF"/>
@@ -278,6 +326,12 @@
     <w:p>
       <w:pPr/>
       <w:r>
+        <w:rPr>
+          <w:rStyle w:val="IntenseQuoteChar"/>
+        </w:rPr>
+        <w:t xml:space="preserve">12. </w:t>
+      </w:r>
+      <w:r>
         <w:t>Here is a statement supported by a reference (</w:t>
       </w:r>
       <w:r>
@@ -293,17 +347,35 @@
     <w:p>
       <w:pPr/>
       <w:r>
+        <w:rPr>
+          <w:rStyle w:val="IntenseQuoteChar"/>
+        </w:rPr>
+        <w:t xml:space="preserve">13. </w:t>
+      </w:r>
+      <w:r>
         <w:t>Lorem ipsum dolor sit amet, consectetur adipiscing elit, sed do eiusmod tempor incididunt ut labore et dolore magna aliqua. Ut enim ad minim veniam, quis nostrud exercitation ullamco laboris nisi ut aliquip ex ea commodo consequat. Duis aute irure dolor in reprehenderit in voluptate velit esse cillum dolore eu fugiat nulla pariatur. Excepteur sint occaecat cupidatat non proident, sunt in culpa qui officia deserunt mollit anim id est laborum.</w:t>
       </w:r>
     </w:p>
     <w:p>
       <w:pPr/>
       <w:r>
+        <w:rPr>
+          <w:rStyle w:val="IntenseQuoteChar"/>
+        </w:rPr>
+        <w:t xml:space="preserve">14. </w:t>
+      </w:r>
+      <w:r>
         <w:t>Lorem ipsum dolor sit amet, consectetur adipiscing elit, sed do eiusmod tempor incididunt ut labore et dolore magna aliqua. Ut enim ad minim veniam, quis nostrud exercitation ullamco laboris nisi ut aliquip ex ea commodo consequat. Duis aute irure dolor in reprehenderit in voluptate velit esse cillum dolore eu fugiat nulla pariatur. Excepteur sint occaecat cupidatat non proident, sunt in culpa qui officia deserunt mollit anim id est laborum.</w:t>
       </w:r>
     </w:p>
     <w:p>
       <w:pPr/>
+      <w:r>
+        <w:rPr>
+          <w:rStyle w:val="IntenseQuoteChar"/>
+        </w:rPr>
+        <w:t xml:space="preserve">15. </w:t>
+      </w:r>
       <w:r>
         <w:t>Lorem ipsum dolor sit amet, consectetur adipiscing elit, sed do eiusmod tempor incididunt ut labore et dolore magna aliqua. Ut enim ad minim veniam, quis nostrud exercitation ullamco laboris nisi ut aliquip ex ea commodo consequat. Duis aute irure dolor in reprehenderit in voluptate velit esse cillum dolore eu fugiat nulla pariatur. Excepteur sint occaecat cupidatat non proident, sunt in culpa qui officia deserunt mollit anim id est laborum.</w:t>
       </w:r>
@@ -330,6 +402,12 @@
         <w:t xml:space="preserve"> </w:t>
       </w:r>
       <w:r>
+        <w:rPr>
+          <w:rStyle w:val="IntenseQuoteChar"/>
+        </w:rPr>
+        <w:t xml:space="preserve">16. </w:t>
+      </w:r>
+      <w:r>
         <w:t>This is the footnote text.</w:t>
       </w:r>
     </w:p>
@@ -343,6 +421,12 @@
     </w:p>
     <w:p>
       <w:pPr/>
+      <w:r>
+        <w:rPr>
+          <w:rStyle w:val="IntenseQuoteChar"/>
+        </w:rPr>
+        <w:t xml:space="preserve">17. </w:t>
+      </w:r>
       <w:r>
         <w:t>Some text in a chapter subsection</w:t>
       </w:r>
@@ -359,6 +443,12 @@
     </w:p>
     <w:p>
       <w:pPr/>
+      <w:r>
+        <w:rPr>
+          <w:rStyle w:val="IntenseQuoteChar"/>
+        </w:rPr>
+        <w:t xml:space="preserve">18. </w:t>
+      </w:r>
       <w:r>
         <w:t xml:space="preserve">Tomasello on the evolution of agency </w:t>
       </w:r>
@@ -394,6 +484,12 @@
         <w:t xml:space="preserve"> </w:t>
       </w:r>
       <w:r>
+        <w:rPr>
+          <w:rStyle w:val="IntenseQuoteChar"/>
+        </w:rPr>
+        <w:t xml:space="preserve">19. </w:t>
+      </w:r>
+      <w:r>
         <w:t>This is a footnote in a section of a chapter.</w:t>
       </w:r>
     </w:p>
@@ -413,11 +509,23 @@
     <w:p>
       <w:pPr/>
       <w:r>
+        <w:rPr>
+          <w:rStyle w:val="IntenseQuoteChar"/>
+        </w:rPr>
+        <w:t xml:space="preserve">20. </w:t>
+      </w:r>
+      <w:r>
         <w:t>This is chapter 2.</w:t>
       </w:r>
     </w:p>
     <w:p>
       <w:pPr/>
+      <w:r>
+        <w:rPr>
+          <w:rStyle w:val="IntenseQuoteChar"/>
+        </w:rPr>
+        <w:t xml:space="preserve">21. </w:t>
+      </w:r>
       <w:r>
         <w:t>Here is a second footnote</w:t>
       </w:r>
@@ -434,6 +542,12 @@
     </w:p>
     <w:p>
       <w:pPr/>
+      <w:r>
+        <w:rPr>
+          <w:rStyle w:val="IntenseQuoteChar"/>
+        </w:rPr>
+        <w:t xml:space="preserve">22. </w:t>
+      </w:r>
       <w:r>
         <w:t>Some Python code:</w:t>
       </w:r>
@@ -491,6 +605,12 @@
       </w:r>
       <w:r>
         <w:t xml:space="preserve"> </w:t>
+      </w:r>
+      <w:r>
+        <w:rPr>
+          <w:rStyle w:val="IntenseQuoteChar"/>
+        </w:rPr>
+        <w:t xml:space="preserve">23. </w:t>
       </w:r>
       <w:r>
         <w:t>And this is the definition of the second footnote.</w:t>
@@ -570,7 +690,7 @@
       <w:r>
         <w:t xml:space="preserve"> </w:t>
       </w:r>
-      <w:hyperlink r:id="rId12">
+      <w:hyperlink r:id="rId13">
         <w:r>
           <w:rPr>
             <w:color w:val="2222FF"/>
@@ -581,7 +701,7 @@
       <w:r>
         <w:t xml:space="preserve">, </w:t>
       </w:r>
-      <w:hyperlink r:id="rId13">
+      <w:hyperlink r:id="rId14">
         <w:r>
           <w:rPr>
             <w:color w:val="2222FF"/>
@@ -621,7 +741,7 @@
       <w:r>
         <w:t xml:space="preserve"> </w:t>
       </w:r>
-      <w:hyperlink r:id="rId14">
+      <w:hyperlink r:id="rId15">
         <w:r>
           <w:rPr>
             <w:color w:val="2222FF"/>
@@ -663,7 +783,8 @@
       </w:r>
     </w:p>
     <w:sectPr>
-      <w:headerReference w:type="default" r:id="rId9"/>
+      <w:footerReference w:type="default" r:id="rId9"/>
+      <w:headerReference w:type="default" r:id="rId10"/>
       <w:pgSz w:w="11906" w:h="16838"/>
       <w:pgMar w:top="1440" w:right="1440" w:bottom="1440" w:left="1440" w:header="720" w:footer="720" w:gutter="0"/>
       <w:cols w:space="720"/>
@@ -671,6 +792,21 @@
     </w:sectPr>
   </w:body>
 </w:document>
+</file>
+
+<file path=word/footer1.xml><?xml version="1.0" encoding="utf-8"?>
+<w:ftr xmlns:m="http://schemas.openxmlformats.org/officeDocument/2006/math" xmlns:mc="http://schemas.openxmlformats.org/markup-compatibility/2006" xmlns:mo="http://schemas.microsoft.com/office/mac/office/2008/main" xmlns:mv="urn:schemas-microsoft-com:mac:vml" xmlns:o="urn:schemas-microsoft-com:office:office" xmlns:r="http://schemas.openxmlformats.org/officeDocument/2006/relationships" xmlns:v="urn:schemas-microsoft-com:vml" xmlns:w10="urn:schemas-microsoft-com:office:word" xmlns:w14="http://schemas.microsoft.com/office/word/2010/wordml" xmlns:w="http://schemas.openxmlformats.org/wordprocessingml/2006/main" xmlns:wne="http://schemas.microsoft.com/office/word/2006/wordml" xmlns:wp14="http://schemas.microsoft.com/office/word/2010/wordprocessingDrawing" xmlns:wp="http://schemas.openxmlformats.org/drawingml/2006/wordprocessingDrawing" xmlns:wpc="http://schemas.microsoft.com/office/word/2010/wordprocessingCanvas" xmlns:wpg="http://schemas.microsoft.com/office/word/2010/wordprocessingGroup" xmlns:wpi="http://schemas.microsoft.com/office/word/2010/wordprocessingInk" xmlns:wps="http://schemas.microsoft.com/office/word/2010/wordprocessingShape" mc:Ignorable="w14 wp14">
+  <w:p>
+    <w:pPr>
+      <w:pStyle w:val="Footer"/>
+    </w:pPr>
+    <w:r>
+      <w:t>Skapad: 2026-06-24 20:04</w:t>
+      <w:tab/>
+      <w:t>Senast ändrad: 2026-06-24 18:31</w:t>
+    </w:r>
+  </w:p>
+</w:ftr>
 </file>
 
 <file path=word/header1.xml><?xml version="1.0" encoding="utf-8"?>
@@ -1096,6 +1232,9 @@
       </w:tabs>
       <w:spacing w:after="0" w:line="240" w:lineRule="auto"/>
     </w:pPr>
+    <w:rPr>
+      <w:sz w:val="20"/>
+    </w:rPr>
   </w:style>
   <w:style w:type="character" w:customStyle="1" w:styleId="FooterChar">
     <w:name w:val="Footer Char"/>

</xml_diff>

<commit_message>
Text ordinals output. Closes #1.
</commit_message>
<xml_diff>
--- a/main.docx
+++ b/main.docx
@@ -28,12 +28,6 @@
     </w:p>
     <w:p>
       <w:pPr/>
-      <w:r>
-        <w:rPr>
-          <w:rStyle w:val="IntenseQuoteChar"/>
-        </w:rPr>
-        <w:t xml:space="preserve">1. </w:t>
-      </w:r>
       <w:r>
         <w:t>This is a synopsis, or some such text.</w:t>
       </w:r>
@@ -101,18 +95,12 @@
     <w:p>
       <w:pPr/>
       <w:r>
-        <w:rPr>
-          <w:rStyle w:val="IntenseQuoteChar"/>
-        </w:rPr>
-        <w:t xml:space="preserve">2. </w:t>
-      </w:r>
-      <w:r>
         <w:t>This is chapter 1, without explicit title.</w:t>
       </w:r>
     </w:p>
     <w:p>
       <w:pPr>
-        <w:pStyle w:val="Title1"/>
+        <w:pStyle w:val="Title2"/>
       </w:pPr>
       <w:r>
         <w:t>Test title, should be level 2</w:t>
@@ -120,7 +108,7 @@
     </w:p>
     <w:p>
       <w:pPr>
-        <w:pStyle w:val="Title2"/>
+        <w:pStyle w:val="Title3"/>
       </w:pPr>
       <w:r>
         <w:t>Test subtitle</w:t>
@@ -128,7 +116,7 @@
     </w:p>
     <w:p>
       <w:pPr>
-        <w:pStyle w:val="Title3"/>
+        <w:pStyle w:val="Title4"/>
       </w:pPr>
       <w:r>
         <w:t>Title level 3</w:t>
@@ -136,7 +124,7 @@
     </w:p>
     <w:p>
       <w:pPr>
-        <w:pStyle w:val="Title4"/>
+        <w:pStyle w:val="Title5"/>
       </w:pPr>
       <w:r>
         <w:t>Title level 4</w:t>
@@ -144,20 +132,22 @@
     </w:p>
     <w:p>
       <w:pPr>
-        <w:pStyle w:val="Title5"/>
+        <w:pStyle w:val="Title6"/>
       </w:pPr>
       <w:r>
         <w:t>Title level 5</w:t>
       </w:r>
     </w:p>
     <w:p>
-      <w:pPr/>
       <w:r>
         <w:rPr>
-          <w:rStyle w:val="IntenseQuoteChar"/>
+          <w:i/>
         </w:rPr>
-        <w:t xml:space="preserve">3. </w:t>
+        <w:t>Title level 6</w:t>
       </w:r>
+    </w:p>
+    <w:p>
+      <w:pPr/>
       <w:r>
         <w:t>And some ordinary text.</w:t>
       </w:r>
@@ -167,12 +157,6 @@
         <w:pStyle w:val="ListBullet"/>
       </w:pPr>
       <w:r>
-        <w:rPr>
-          <w:rStyle w:val="IntenseQuoteChar"/>
-        </w:rPr>
-        <w:t xml:space="preserve">4. </w:t>
-      </w:r>
-      <w:r>
         <w:t>List item</w:t>
       </w:r>
     </w:p>
@@ -180,12 +164,6 @@
       <w:pPr>
         <w:pStyle w:val="ListBullet"/>
       </w:pPr>
-      <w:r>
-        <w:rPr>
-          <w:rStyle w:val="IntenseQuoteChar"/>
-        </w:rPr>
-        <w:t xml:space="preserve">5. </w:t>
-      </w:r>
       <w:r>
         <w:t>Another list item</w:t>
       </w:r>
@@ -195,12 +173,6 @@
         <w:pStyle w:val="ListNumber"/>
       </w:pPr>
       <w:r>
-        <w:rPr>
-          <w:rStyle w:val="IntenseQuoteChar"/>
-        </w:rPr>
-        <w:t xml:space="preserve">6. </w:t>
-      </w:r>
-      <w:r>
         <w:t>First list item</w:t>
       </w:r>
     </w:p>
@@ -208,12 +180,6 @@
       <w:pPr>
         <w:pStyle w:val="ListNumber"/>
       </w:pPr>
-      <w:r>
-        <w:rPr>
-          <w:rStyle w:val="IntenseQuoteChar"/>
-        </w:rPr>
-        <w:t xml:space="preserve">7. </w:t>
-      </w:r>
       <w:r>
         <w:t>Second list item</w:t>
       </w:r>
@@ -223,12 +189,6 @@
         <w:pStyle w:val="ListBullet2"/>
       </w:pPr>
       <w:r>
-        <w:rPr>
-          <w:rStyle w:val="IntenseQuoteChar"/>
-        </w:rPr>
-        <w:t xml:space="preserve">8. </w:t>
-      </w:r>
-      <w:r>
         <w:t>Sublist item</w:t>
       </w:r>
     </w:p>
@@ -237,23 +197,11 @@
         <w:pStyle w:val="ListBullet2"/>
       </w:pPr>
       <w:r>
-        <w:rPr>
-          <w:rStyle w:val="IntenseQuoteChar"/>
-        </w:rPr>
-        <w:t xml:space="preserve">9. </w:t>
-      </w:r>
-      <w:r>
         <w:t>Another sublist item</w:t>
       </w:r>
     </w:p>
     <w:p>
       <w:pPr/>
-      <w:r>
-        <w:rPr>
-          <w:rStyle w:val="IntenseQuoteChar"/>
-        </w:rPr>
-        <w:t xml:space="preserve">10. </w:t>
-      </w:r>
       <w:r>
         <w:rPr>
           <w:i/>
@@ -276,12 +224,6 @@
     </w:p>
     <w:p>
       <w:pPr/>
-      <w:r>
-        <w:rPr>
-          <w:rStyle w:val="IntenseQuoteChar"/>
-        </w:rPr>
-        <w:t xml:space="preserve">11. </w:t>
-      </w:r>
       <w:r>
         <w:t xml:space="preserve">More text in a new paragraph with a </w:t>
       </w:r>
@@ -326,12 +268,6 @@
     <w:p>
       <w:pPr/>
       <w:r>
-        <w:rPr>
-          <w:rStyle w:val="IntenseQuoteChar"/>
-        </w:rPr>
-        <w:t xml:space="preserve">12. </w:t>
-      </w:r>
-      <w:r>
         <w:t>Here is a statement supported by a reference (</w:t>
       </w:r>
       <w:r>
@@ -347,35 +283,17 @@
     <w:p>
       <w:pPr/>
       <w:r>
-        <w:rPr>
-          <w:rStyle w:val="IntenseQuoteChar"/>
-        </w:rPr>
-        <w:t xml:space="preserve">13. </w:t>
+        <w:t>Lorem ipsum dolor sit amet, consectetur adipiscing elit, sed do eiusmod tempor incididunt ut labore et dolore magna aliqua. Ut enim ad minim veniam, quis nostrud exercitation ullamco laboris nisi ut aliquip ex ea commodo consequat. Duis aute irure dolor in reprehenderit in voluptate velit esse cillum dolore eu fugiat nulla pariatur. Excepteur sint occaecat cupidatat non proident, sunt in culpa qui officia deserunt mollit anim id est laborum.</w:t>
       </w:r>
+    </w:p>
+    <w:p>
+      <w:pPr/>
       <w:r>
         <w:t>Lorem ipsum dolor sit amet, consectetur adipiscing elit, sed do eiusmod tempor incididunt ut labore et dolore magna aliqua. Ut enim ad minim veniam, quis nostrud exercitation ullamco laboris nisi ut aliquip ex ea commodo consequat. Duis aute irure dolor in reprehenderit in voluptate velit esse cillum dolore eu fugiat nulla pariatur. Excepteur sint occaecat cupidatat non proident, sunt in culpa qui officia deserunt mollit anim id est laborum.</w:t>
       </w:r>
     </w:p>
     <w:p>
       <w:pPr/>
-      <w:r>
-        <w:rPr>
-          <w:rStyle w:val="IntenseQuoteChar"/>
-        </w:rPr>
-        <w:t xml:space="preserve">14. </w:t>
-      </w:r>
-      <w:r>
-        <w:t>Lorem ipsum dolor sit amet, consectetur adipiscing elit, sed do eiusmod tempor incididunt ut labore et dolore magna aliqua. Ut enim ad minim veniam, quis nostrud exercitation ullamco laboris nisi ut aliquip ex ea commodo consequat. Duis aute irure dolor in reprehenderit in voluptate velit esse cillum dolore eu fugiat nulla pariatur. Excepteur sint occaecat cupidatat non proident, sunt in culpa qui officia deserunt mollit anim id est laborum.</w:t>
-      </w:r>
-    </w:p>
-    <w:p>
-      <w:pPr/>
-      <w:r>
-        <w:rPr>
-          <w:rStyle w:val="IntenseQuoteChar"/>
-        </w:rPr>
-        <w:t xml:space="preserve">15. </w:t>
-      </w:r>
       <w:r>
         <w:t>Lorem ipsum dolor sit amet, consectetur adipiscing elit, sed do eiusmod tempor incididunt ut labore et dolore magna aliqua. Ut enim ad minim veniam, quis nostrud exercitation ullamco laboris nisi ut aliquip ex ea commodo consequat. Duis aute irure dolor in reprehenderit in voluptate velit esse cillum dolore eu fugiat nulla pariatur. Excepteur sint occaecat cupidatat non proident, sunt in culpa qui officia deserunt mollit anim id est laborum.</w:t>
       </w:r>
@@ -402,12 +320,6 @@
         <w:t xml:space="preserve"> </w:t>
       </w:r>
       <w:r>
-        <w:rPr>
-          <w:rStyle w:val="IntenseQuoteChar"/>
-        </w:rPr>
-        <w:t xml:space="preserve">16. </w:t>
-      </w:r>
-      <w:r>
         <w:t>This is the footnote text.</w:t>
       </w:r>
     </w:p>
@@ -421,12 +333,6 @@
     </w:p>
     <w:p>
       <w:pPr/>
-      <w:r>
-        <w:rPr>
-          <w:rStyle w:val="IntenseQuoteChar"/>
-        </w:rPr>
-        <w:t xml:space="preserve">17. </w:t>
-      </w:r>
       <w:r>
         <w:t>Some text in a chapter subsection</w:t>
       </w:r>
@@ -443,12 +349,6 @@
     </w:p>
     <w:p>
       <w:pPr/>
-      <w:r>
-        <w:rPr>
-          <w:rStyle w:val="IntenseQuoteChar"/>
-        </w:rPr>
-        <w:t xml:space="preserve">18. </w:t>
-      </w:r>
       <w:r>
         <w:t xml:space="preserve">Tomasello on the evolution of agency </w:t>
       </w:r>
@@ -484,12 +384,6 @@
         <w:t xml:space="preserve"> </w:t>
       </w:r>
       <w:r>
-        <w:rPr>
-          <w:rStyle w:val="IntenseQuoteChar"/>
-        </w:rPr>
-        <w:t xml:space="preserve">19. </w:t>
-      </w:r>
-      <w:r>
         <w:t>This is a footnote in a section of a chapter.</w:t>
       </w:r>
     </w:p>
@@ -509,23 +403,11 @@
     <w:p>
       <w:pPr/>
       <w:r>
-        <w:rPr>
-          <w:rStyle w:val="IntenseQuoteChar"/>
-        </w:rPr>
-        <w:t xml:space="preserve">20. </w:t>
-      </w:r>
-      <w:r>
         <w:t>This is chapter 2.</w:t>
       </w:r>
     </w:p>
     <w:p>
       <w:pPr/>
-      <w:r>
-        <w:rPr>
-          <w:rStyle w:val="IntenseQuoteChar"/>
-        </w:rPr>
-        <w:t xml:space="preserve">21. </w:t>
-      </w:r>
       <w:r>
         <w:t>Here is a second footnote</w:t>
       </w:r>
@@ -542,12 +424,6 @@
     </w:p>
     <w:p>
       <w:pPr/>
-      <w:r>
-        <w:rPr>
-          <w:rStyle w:val="IntenseQuoteChar"/>
-        </w:rPr>
-        <w:t xml:space="preserve">22. </w:t>
-      </w:r>
       <w:r>
         <w:t>Some Python code:</w:t>
       </w:r>
@@ -605,12 +481,6 @@
       </w:r>
       <w:r>
         <w:t xml:space="preserve"> </w:t>
-      </w:r>
-      <w:r>
-        <w:rPr>
-          <w:rStyle w:val="IntenseQuoteChar"/>
-        </w:rPr>
-        <w:t xml:space="preserve">23. </w:t>
       </w:r>
       <w:r>
         <w:t>And this is the definition of the second footnote.</w:t>
@@ -775,11 +645,12 @@
     <w:p>
       <w:pPr>
         <w:pStyle w:val="BodyText"/>
+        <w:keepNext/>
         <w:spacing w:after="160"/>
         <w:ind w:left="300"/>
       </w:pPr>
       <w:r>
-        <w:t>chapter1</w:t>
+        <w:t>1. chapter1</w:t>
       </w:r>
     </w:p>
     <w:sectPr>
@@ -801,9 +672,9 @@
       <w:pStyle w:val="Footer"/>
     </w:pPr>
     <w:r>
-      <w:t>Skapad: 2026-06-24 20:04</w:t>
+      <w:t>Skapad: 2026-06-26 14:31</w:t>
       <w:tab/>
-      <w:t>Senast ändrad: 2026-06-24 18:31</w:t>
+      <w:t>Senast ändrad: 2026-06-26 14:28</w:t>
     </w:r>
   </w:p>
 </w:ftr>

</xml_diff>